<commit_message>
Fix table RTL rendering and add June platform cost
- Set table to visually right-to-left (bidiVisual) and right-aligned so
  columns flow right-to-left, matching the document's RTL text.
- Add known June platform purchase cost (~$30,000) to the June row.

Co-Authored-By: Claude Sonnet 5 <noreply@anthropic.com>
Claude-Session: https://claude.ai/code/session_01FsPmqsFHsaogScknvD41Ww
</commit_message>
<xml_diff>
--- a/docs/field-app-alternatives.docx
+++ b/docs/field-app-alternatives.docx
@@ -199,7 +199,9 @@
     </w:p>
     <w:tbl>
       <w:tblPr>
+        <w:bidiVisual/>
         <w:tblW w:type="dxa" w:w="14640"/>
+        <w:jc w:val="right"/>
         <w:tblBorders>
           <w:top w:val="single" w:color="auto" w:sz="4"/>
           <w:left w:val="single" w:color="auto" w:sz="4"/>
@@ -2504,7 +2506,7 @@
                 <w:szCs w:val="17"/>
                 <w:rtl/>
               </w:rPr>
-              <w:t xml:space="preserve">• דורש בדיקת התאמה/עלות שטרם בוצעה</w:t>
+              <w:t xml:space="preserve">• בנוסף לעלות הרכישה יש עלות פיתוח עצמי נוספת שטרם הוערכה</w:t>
             </w:r>
           </w:p>
           <w:p>
@@ -2557,7 +2559,7 @@
                 <w:szCs w:val="17"/>
                 <w:rtl/>
               </w:rPr>
-              <w:t xml:space="preserve">טרם נבדק</w:t>
+              <w:t xml:space="preserve">כ-30,000$ לרכישת מוצר June (ללא עלות הפיתוח העצמי מעליו)</w:t>
             </w:r>
           </w:p>
         </w:tc>

</xml_diff>